<commit_message>
Améliorer la section 6 du guide : URL GitHub exacte et option ZIP
- Remplace l'URL générique par l'URL réelle du repo (ckerlalli-hub/Charles-B)
- Ajoute l'option de téléchargement ZIP pour les utilisateurs sans Git
- Clarifie que les utilisateurs n'ont pas besoin de leur propre compte GitHub
- Git devient optionnel dans les prérequis

https://claude.ai/code/session_01RDFqmerGcWNRp216MppQBf
</commit_message>
<xml_diff>
--- a/Guide_Charles-B_Gmail_Compiler.docx
+++ b/Guide_Charles-B_Gmail_Compiler.docx
@@ -97,7 +97,7 @@
         <w:pStyle w:val="ListNumber"/>
       </w:pPr>
       <w:r>
-        <w:t>6. Installer le projet sur votre PC (Windows)</w:t>
+        <w:t>6. Recuperer le projet sur votre PC</w:t>
       </w:r>
     </w:p>
     <w:p>
@@ -268,7 +268,7 @@
         <w:pStyle w:val="ListBullet"/>
       </w:pPr>
       <w:r>
-        <w:t>Git installe (pour cloner le projet)</w:t>
+        <w:t>Git installe (optionnel, pour cloner le projet — sinon le ZIP suffit)</w:t>
       </w:r>
     </w:p>
     <w:p>
@@ -813,7 +813,7 @@
         <w:pStyle w:val="Heading1"/>
       </w:pPr>
       <w:r>
-        <w:t>6 — Installer le projet sur votre PC (Windows)</w:t>
+        <w:t>6 — Recuperer le projet sur votre PC</w:t>
       </w:r>
     </w:p>
     <w:p>
@@ -822,31 +822,16 @@
           <w:b w:val="0"/>
           <w:i w:val="0"/>
         </w:rPr>
-        <w:t>Cette section explique comment installer le projet en utilisant l'Invite de commandes Windows (cmd) ou PowerShell.</w:t>
+        <w:t>Le projet est heberge sur GitHub a l'adresse suivante :</w:t>
       </w:r>
     </w:p>
     <w:p>
-      <w:pPr>
-        <w:pStyle w:val="Heading2"/>
-      </w:pPr>
       <w:r>
-        <w:t>6.1 — Ouvrir l'Invite de commandes</w:t>
-      </w:r>
-    </w:p>
-    <w:p>
-      <w:pPr>
-        <w:pStyle w:val="ListNumber"/>
-      </w:pPr>
-      <w:r>
-        <w:t>Appuyez sur les touches Windows + R</w:t>
-      </w:r>
-    </w:p>
-    <w:p>
-      <w:pPr>
-        <w:pStyle w:val="ListNumber"/>
-      </w:pPr>
-      <w:r>
-        <w:t>Tapez cmd puis appuyez sur Entree</w:t>
+        <w:rPr>
+          <w:b/>
+          <w:i w:val="0"/>
+        </w:rPr>
+        <w:t>https://github.com/ckerlalli-hub/Charles-B</w:t>
       </w:r>
     </w:p>
     <w:p>
@@ -855,7 +840,7 @@
           <w:b w:val="0"/>
           <w:i/>
         </w:rPr>
-        <w:t>Ou bien : recherchez « Invite de commandes » dans le menu Demarrer.</w:t>
+        <w:t>Vous n'avez pas besoin de creer votre propre compte GitHub ni votre propre depot. Il suffit de telecharger le projet une seule fois.</w:t>
       </w:r>
     </w:p>
     <w:p>
@@ -863,7 +848,55 @@
         <w:pStyle w:val="Heading2"/>
       </w:pPr>
       <w:r>
-        <w:t>6.2 — Se placer dans le dossier souhaite</w:t>
+        <w:t>Option A — Telecharger le ZIP (le plus simple, sans Git)</w:t>
+      </w:r>
+    </w:p>
+    <w:p>
+      <w:pPr>
+        <w:pStyle w:val="ListNumber"/>
+      </w:pPr>
+      <w:r>
+        <w:t>Rendez-vous sur https://github.com/ckerlalli-hub/Charles-B</w:t>
+      </w:r>
+    </w:p>
+    <w:p>
+      <w:pPr>
+        <w:pStyle w:val="ListNumber"/>
+      </w:pPr>
+      <w:r>
+        <w:t>Cliquez sur le bouton vert « &lt;&gt; Code »</w:t>
+      </w:r>
+    </w:p>
+    <w:p>
+      <w:pPr>
+        <w:pStyle w:val="ListNumber"/>
+      </w:pPr>
+      <w:r>
+        <w:t>Cliquez sur « Download ZIP »</w:t>
+      </w:r>
+    </w:p>
+    <w:p>
+      <w:pPr>
+        <w:pStyle w:val="ListNumber"/>
+      </w:pPr>
+      <w:r>
+        <w:t>Decompressez le fichier ZIP sur votre ordinateur (par exemple dans le dossier Documents ou sur le Bureau)</w:t>
+      </w:r>
+    </w:p>
+    <w:p>
+      <w:pPr>
+        <w:pStyle w:val="ListNumber"/>
+      </w:pPr>
+      <w:r>
+        <w:t>Vous obtenez un dossier « Charles-B-main ». Renommez-le en « Charles-B » si vous le souhaitez.</w:t>
+      </w:r>
+    </w:p>
+    <w:p>
+      <w:pPr>
+        <w:pStyle w:val="Heading2"/>
+      </w:pPr>
+      <w:r>
+        <w:t>Option B — Cloner avec Git (si Git est installe)</w:t>
       </w:r>
     </w:p>
     <w:p>
@@ -872,7 +905,7 @@
           <w:b w:val="0"/>
           <w:i w:val="0"/>
         </w:rPr>
-        <w:t>Naviguez vers le dossier ou vous souhaitez installer le projet. Par exemple, pour l'installer sur le Bureau :</w:t>
+        <w:t>Ouvrez l'Invite de commandes (Windows + R → cmd → Entree) :</w:t>
       </w:r>
     </w:p>
     <w:p>
@@ -890,14 +923,6 @@
     </w:p>
     <w:p>
       <w:pPr>
-        <w:pStyle w:val="Heading2"/>
-      </w:pPr>
-      <w:r>
-        <w:t>6.3 — Cloner le projet avec Git</w:t>
-      </w:r>
-    </w:p>
-    <w:p>
-      <w:pPr>
         <w:ind w:left="432"/>
       </w:pPr>
       <w:r>
@@ -906,7 +931,20 @@
           <w:color w:val="1E1E1E"/>
           <w:sz w:val="18"/>
         </w:rPr>
-        <w:t>git clone https://github.com/VOTRE-UTILISATEUR/Charles-B.git</w:t>
+        <w:t>git clone https://github.com/ckerlalli-hub/Charles-B.git</w:t>
+      </w:r>
+    </w:p>
+    <w:p>
+      <w:pPr>
+        <w:ind w:left="432"/>
+      </w:pPr>
+      <w:r>
+        <w:rPr>
+          <w:rFonts w:ascii="Consolas" w:hAnsi="Consolas"/>
+          <w:color w:val="1E1E1E"/>
+          <w:sz w:val="18"/>
+        </w:rPr>
+        <w:t>cd Charles-B</w:t>
       </w:r>
     </w:p>
     <w:p>
@@ -921,29 +959,7 @@
         <w:rPr>
           <w:i/>
         </w:rPr>
-        <w:t>Remplacez VOTRE-UTILISATEUR par le nom d'utilisateur GitHub qui vous a ete communique.</w:t>
-      </w:r>
-    </w:p>
-    <w:p>
-      <w:r>
-        <w:rPr>
-          <w:b w:val="0"/>
-          <w:i w:val="0"/>
-        </w:rPr>
-        <w:t>Puis entrez dans le dossier du projet :</w:t>
-      </w:r>
-    </w:p>
-    <w:p>
-      <w:pPr>
-        <w:ind w:left="432"/>
-      </w:pPr>
-      <w:r>
-        <w:rPr>
-          <w:rFonts w:ascii="Consolas" w:hAnsi="Consolas"/>
-          <w:color w:val="1E1E1E"/>
-          <w:sz w:val="18"/>
-        </w:rPr>
-        <w:t>cd Charles-B</w:t>
+        <w:t>Avantage de Git : vous pourrez mettre a jour le projet plus tard avec un simple « git pull ».</w:t>
       </w:r>
     </w:p>
     <w:p>

</xml_diff>

<commit_message>
Ajouter interface web Flask et slash command Claude Code
- Nouvelle interface web (web_app.py) : formulaire pour compiler
  les emails sans utiliser le terminal
- Nouveau skill Claude Code (.claude/commands/compile-gmail.md) :
  slash command /compile-gmail pour lancer depuis Claude Code
- Ajout de Flask dans requirements.txt
- Documentation mise à jour (sections 12 et 13 dans GUIDE.md et docx)

https://claude.ai/code/session_01RDFqmerGcWNRp216MppQBf
</commit_message>
<xml_diff>
--- a/Guide_Charles-B_Gmail_Compiler.docx
+++ b/Guide_Charles-B_Gmail_Compiler.docx
@@ -145,7 +145,23 @@
         <w:pStyle w:val="ListNumber"/>
       </w:pPr>
       <w:r>
-        <w:t>12. Questions frequentes</w:t>
+        <w:t>12. Interface web (alternative au terminal)</w:t>
+      </w:r>
+    </w:p>
+    <w:p>
+      <w:pPr>
+        <w:pStyle w:val="ListNumber"/>
+      </w:pPr>
+      <w:r>
+        <w:t>13. Utilisation avec Claude Code</w:t>
+      </w:r>
+    </w:p>
+    <w:p>
+      <w:pPr>
+        <w:pStyle w:val="ListNumber"/>
+      </w:pPr>
+      <w:r>
+        <w:t>14. Questions frequentes</w:t>
       </w:r>
     </w:p>
     <w:p>
@@ -2285,7 +2301,186 @@
         <w:pStyle w:val="Heading1"/>
       </w:pPr>
       <w:r>
-        <w:t>12 — Questions frequentes</w:t>
+        <w:t>12 — Interface web (alternative au terminal)</w:t>
+      </w:r>
+    </w:p>
+    <w:p>
+      <w:r>
+        <w:rPr>
+          <w:b w:val="0"/>
+          <w:i w:val="0"/>
+        </w:rPr>
+        <w:t>Si vous preferez ne pas utiliser le terminal, une interface web est disponible.</w:t>
+      </w:r>
+    </w:p>
+    <w:p>
+      <w:pPr>
+        <w:pStyle w:val="Heading2"/>
+      </w:pPr>
+      <w:r>
+        <w:t>Lancement</w:t>
+      </w:r>
+    </w:p>
+    <w:p>
+      <w:r>
+        <w:rPr>
+          <w:b w:val="0"/>
+          <w:i w:val="0"/>
+        </w:rPr>
+        <w:t>Assurez-vous d'avoir installe les dependances, puis lancez :</w:t>
+      </w:r>
+    </w:p>
+    <w:p>
+      <w:pPr>
+        <w:ind w:left="432"/>
+      </w:pPr>
+      <w:r>
+        <w:rPr>
+          <w:rFonts w:ascii="Consolas" w:hAnsi="Consolas"/>
+          <w:color w:val="1E1E1E"/>
+          <w:sz w:val="18"/>
+        </w:rPr>
+        <w:t>pip install -r requirements.txt</w:t>
+      </w:r>
+    </w:p>
+    <w:p>
+      <w:pPr>
+        <w:ind w:left="432"/>
+      </w:pPr>
+      <w:r>
+        <w:rPr>
+          <w:rFonts w:ascii="Consolas" w:hAnsi="Consolas"/>
+          <w:color w:val="1E1E1E"/>
+          <w:sz w:val="18"/>
+        </w:rPr>
+        <w:t>python web_app.py</w:t>
+      </w:r>
+    </w:p>
+    <w:p>
+      <w:r>
+        <w:rPr>
+          <w:b w:val="0"/>
+          <w:i w:val="0"/>
+        </w:rPr>
+        <w:t>Votre navigateur ouvrira la page http://localhost:5000.</w:t>
+      </w:r>
+    </w:p>
+    <w:p>
+      <w:pPr>
+        <w:pStyle w:val="Heading2"/>
+      </w:pPr>
+      <w:r>
+        <w:t>Utilisation</w:t>
+      </w:r>
+    </w:p>
+    <w:p>
+      <w:pPr>
+        <w:pStyle w:val="ListNumber"/>
+      </w:pPr>
+      <w:r>
+        <w:t>Premiere fois : l'interface vous demandera de lancer d'abord python main.py pour vous authentifier aupres de Google (une seule fois)</w:t>
+      </w:r>
+    </w:p>
+    <w:p>
+      <w:pPr>
+        <w:pStyle w:val="ListNumber"/>
+      </w:pPr>
+      <w:r>
+        <w:t>Ensuite : selectionnez votre label Gmail dans la liste deroulante, choisissez le nombre max d'emails, et cliquez sur « Compiler les emails »</w:t>
+      </w:r>
+    </w:p>
+    <w:p>
+      <w:pPr>
+        <w:pStyle w:val="ListNumber"/>
+      </w:pPr>
+      <w:r>
+        <w:t>Le lien vers votre Google Doc s'affiche directement dans la page</w:t>
+      </w:r>
+    </w:p>
+    <w:p>
+      <w:pPr>
+        <w:jc w:val="center"/>
+      </w:pPr>
+      <w:r>
+        <w:rPr>
+          <w:color w:val="B4B4B4"/>
+        </w:rPr>
+        <w:t>────────────────────────────────────────────────────────────</w:t>
+      </w:r>
+    </w:p>
+    <w:p>
+      <w:pPr>
+        <w:pStyle w:val="Heading1"/>
+      </w:pPr>
+      <w:r>
+        <w:t>13 — Utilisation avec Claude Code (slash command)</w:t>
+      </w:r>
+    </w:p>
+    <w:p>
+      <w:r>
+        <w:rPr>
+          <w:b w:val="0"/>
+          <w:i w:val="0"/>
+        </w:rPr>
+        <w:t>Si vous utilisez Claude Code (l'outil CLI d'Anthropic), une commande personnalisee est disponible :</w:t>
+      </w:r>
+    </w:p>
+    <w:p>
+      <w:pPr>
+        <w:ind w:left="432"/>
+      </w:pPr>
+      <w:r>
+        <w:rPr>
+          <w:rFonts w:ascii="Consolas" w:hAnsi="Consolas"/>
+          <w:color w:val="1E1E1E"/>
+          <w:sz w:val="18"/>
+        </w:rPr>
+        <w:t>/compile-gmail Newsletters</w:t>
+        <w:br/>
+        <w:t>/compile-gmail "Rapports mensuels"</w:t>
+      </w:r>
+    </w:p>
+    <w:p>
+      <w:r>
+        <w:rPr>
+          <w:b w:val="0"/>
+          <w:i/>
+        </w:rPr>
+        <w:t>Cela lance directement la compilation sans avoir a taper la commande Python complete.</w:t>
+      </w:r>
+    </w:p>
+    <w:p>
+      <w:r>
+        <w:rPr>
+          <w:b/>
+          <w:color w:val="0064B4"/>
+        </w:rPr>
+        <w:t xml:space="preserve">Note : </w:t>
+      </w:r>
+      <w:r>
+        <w:rPr>
+          <w:i/>
+        </w:rPr>
+        <w:t>Le fichier de commande se trouve dans .claude/commands/compile-gmail.md.</w:t>
+      </w:r>
+    </w:p>
+    <w:p>
+      <w:pPr>
+        <w:jc w:val="center"/>
+      </w:pPr>
+      <w:r>
+        <w:rPr>
+          <w:color w:val="B4B4B4"/>
+        </w:rPr>
+        <w:t>────────────────────────────────────────────────────────────</w:t>
+      </w:r>
+    </w:p>
+    <w:p>
+      <w:pPr>
+        <w:pStyle w:val="Heading1"/>
+      </w:pPr>
+      <w:r>
+        <w:t>14 — Questions frequentes</w:t>
       </w:r>
     </w:p>
     <w:p>

</xml_diff>